<commit_message>
calendar docx: chanukah + status column
</commit_message>
<xml_diff>
--- a/files/issue-calendar.docx
+++ b/files/issue-calendar.docx
@@ -333,6 +333,16 @@
                 <w:rtl/>
               </w:rPr>
             </w:pPr>
+            <w:r>
+              <w:rPr>
+                <w:rFonts w:ascii="Arial" w:hAnsi="Arial" w:cs="Arial"/>
+                <w:sz w:val="21"/>
+                <w:szCs w:val="21"/>
+                <w:rtl/>
+                <w:lang w:bidi="he-IL"/>
+              </w:rPr>
+              <w:t xml:space="preserve">נשלח</w:t>
+            </w:r>
           </w:p>
         </w:tc>
       </w:tr>
@@ -429,6 +439,16 @@
                 <w:rtl/>
               </w:rPr>
             </w:pPr>
+            <w:r>
+              <w:rPr>
+                <w:rFonts w:ascii="Arial" w:hAnsi="Arial" w:cs="Arial"/>
+                <w:sz w:val="21"/>
+                <w:szCs w:val="21"/>
+                <w:rtl/>
+                <w:lang w:bidi="he-IL"/>
+              </w:rPr>
+              <w:t xml:space="preserve">נשלח</w:t>
+            </w:r>
           </w:p>
         </w:tc>
       </w:tr>
@@ -525,6 +545,16 @@
                 <w:rtl/>
               </w:rPr>
             </w:pPr>
+            <w:r>
+              <w:rPr>
+                <w:rFonts w:ascii="Arial" w:hAnsi="Arial" w:cs="Arial"/>
+                <w:sz w:val="21"/>
+                <w:szCs w:val="21"/>
+                <w:rtl/>
+                <w:lang w:bidi="he-IL"/>
+              </w:rPr>
+              <w:t xml:space="preserve">נשלח</w:t>
+            </w:r>
           </w:p>
         </w:tc>
       </w:tr>
@@ -621,6 +651,16 @@
                 <w:rtl/>
               </w:rPr>
             </w:pPr>
+            <w:r>
+              <w:rPr>
+                <w:rFonts w:ascii="Arial" w:hAnsi="Arial" w:cs="Arial"/>
+                <w:sz w:val="21"/>
+                <w:szCs w:val="21"/>
+                <w:rtl/>
+                <w:lang w:bidi="he-IL"/>
+              </w:rPr>
+              <w:t xml:space="preserve">נשלח</w:t>
+            </w:r>
           </w:p>
         </w:tc>
       </w:tr>
@@ -897,6 +937,16 @@
                 <w:rtl/>
               </w:rPr>
             </w:pPr>
+            <w:r>
+              <w:rPr>
+                <w:rFonts w:ascii="Arial" w:hAnsi="Arial" w:cs="Arial"/>
+                <w:sz w:val="21"/>
+                <w:szCs w:val="21"/>
+                <w:rtl/>
+                <w:lang w:bidi="he-IL"/>
+              </w:rPr>
+              <w:t xml:space="preserve">נשלח</w:t>
+            </w:r>
           </w:p>
         </w:tc>
       </w:tr>
@@ -1001,7 +1051,7 @@
                 <w:rtl/>
                 <w:lang w:bidi="he-IL"/>
               </w:rPr>
-              <w:t xml:space="preserve">שבת שובה</w:t>
+              <w:t xml:space="preserve">נשלח · שבת שובה</w:t>
             </w:r>
           </w:p>
         </w:tc>
@@ -1099,6 +1149,16 @@
                 <w:rtl/>
               </w:rPr>
             </w:pPr>
+            <w:r>
+              <w:rPr>
+                <w:rFonts w:ascii="Arial" w:hAnsi="Arial" w:cs="Arial"/>
+                <w:sz w:val="21"/>
+                <w:szCs w:val="21"/>
+                <w:rtl/>
+                <w:lang w:bidi="he-IL"/>
+              </w:rPr>
+              <w:t xml:space="preserve">בעבודה</w:t>
+            </w:r>
           </w:p>
         </w:tc>
       </w:tr>
@@ -1203,7 +1263,7 @@
                 <w:rtl/>
                 <w:lang w:bidi="he-IL"/>
               </w:rPr>
-              <w:t xml:space="preserve">שמיני עצרת</w:t>
+              <w:t xml:space="preserve">בעבודה · שמיני עצרת</w:t>
             </w:r>
           </w:p>
         </w:tc>
@@ -1301,6 +1361,16 @@
                 <w:rtl/>
               </w:rPr>
             </w:pPr>
+            <w:r>
+              <w:rPr>
+                <w:rFonts w:ascii="Arial" w:hAnsi="Arial" w:cs="Arial"/>
+                <w:sz w:val="21"/>
+                <w:szCs w:val="21"/>
+                <w:rtl/>
+                <w:lang w:bidi="he-IL"/>
+              </w:rPr>
+              <w:t xml:space="preserve">בעבודה</w:t>
+            </w:r>
           </w:p>
         </w:tc>
       </w:tr>
@@ -2069,6 +2139,16 @@
                 <w:rtl/>
               </w:rPr>
             </w:pPr>
+            <w:r>
+              <w:rPr>
+                <w:rFonts w:ascii="Arial" w:hAnsi="Arial" w:cs="Arial"/>
+                <w:sz w:val="21"/>
+                <w:szCs w:val="21"/>
+                <w:rtl/>
+                <w:lang w:bidi="he-IL"/>
+              </w:rPr>
+              <w:t xml:space="preserve">שבת חנוכה</w:t>
+            </w:r>
           </w:p>
         </w:tc>
       </w:tr>
@@ -2165,6 +2245,16 @@
                 <w:rtl/>
               </w:rPr>
             </w:pPr>
+            <w:r>
+              <w:rPr>
+                <w:rFonts w:ascii="Arial" w:hAnsi="Arial" w:cs="Arial"/>
+                <w:sz w:val="21"/>
+                <w:szCs w:val="21"/>
+                <w:rtl/>
+                <w:lang w:bidi="he-IL"/>
+              </w:rPr>
+              <w:t xml:space="preserve">שבת חנוכה · זאת חנוכה</w:t>
+            </w:r>
           </w:p>
         </w:tc>
       </w:tr>
@@ -7629,6 +7719,16 @@
                 <w:rtl/>
               </w:rPr>
             </w:pPr>
+            <w:r>
+              <w:rPr>
+                <w:rFonts w:ascii="Arial" w:hAnsi="Arial" w:cs="Arial"/>
+                <w:sz w:val="21"/>
+                <w:szCs w:val="21"/>
+                <w:rtl/>
+                <w:lang w:bidi="he-IL"/>
+              </w:rPr>
+              <w:t xml:space="preserve">שבת חנוכה</w:t>
+            </w:r>
           </w:p>
         </w:tc>
       </w:tr>
@@ -7725,6 +7825,16 @@
                 <w:rtl/>
               </w:rPr>
             </w:pPr>
+            <w:r>
+              <w:rPr>
+                <w:rFonts w:ascii="Arial" w:hAnsi="Arial" w:cs="Arial"/>
+                <w:sz w:val="21"/>
+                <w:szCs w:val="21"/>
+                <w:rtl/>
+                <w:lang w:bidi="he-IL"/>
+              </w:rPr>
+              <w:t xml:space="preserve">שבת חנוכה · זאת חנוכה</w:t>
+            </w:r>
           </w:p>
         </w:tc>
       </w:tr>

</xml_diff>